<commit_message>
cv extraction upload and workers dashboard
</commit_message>
<xml_diff>
--- a/backend/agreement_assets/employee_handbook_template.docx
+++ b/backend/agreement_assets/employee_handbook_template.docx
@@ -2744,11 +2744,13 @@
               <w:rPr>
                 <w:color w:val="FF0000"/>
               </w:rPr>
+              <w:t>We advise that you give a brief history of the organisation, details of the service that the organisation provides</w:t>
             </w:r>
             <w:r>
               <w:rPr>
                 <w:color w:val="FF0000"/>
               </w:rPr>
+              <w:t xml:space="preserve">. </w:t>
             </w:r>
           </w:p>
           <w:p>
@@ -2760,24 +2762,29 @@
                 <w:rFonts w:eastAsia="Times New Roman"/>
                 <w:color w:val="000000"/>
               </w:rPr>
-              <w:t>Osabea Healthcare Solutions Ltd was established in {{about_us_text}} by {{about_us_text}}</w:t>
+              <w:t>Osabea Healthcare Solutions Ltd</w:t>
             </w:r>
             <w:r>
               <w:rPr>
                 <w:rFonts w:eastAsia="Times New Roman"/>
                 <w:color w:val="FF0000"/>
               </w:rPr>
-            </w:r>
-            <w:r>
-              <w:rPr>
-                <w:color w:val="auto"/>
-              </w:rPr>
-            </w:r>
-            <w:r/>
+              <w:t xml:space="preserve"> </w:t>
+            </w:r>
+            <w:r>
+              <w:rPr>
+                <w:color w:val="auto"/>
+              </w:rPr>
+              <w:t xml:space="preserve">was </w:t>
+            </w:r>
+            <w:r>
+              <w:t xml:space="preserve">established in </w:t>
+            </w:r>
             <w:r>
               <w:rPr>
                 <w:color w:val="FF0000"/>
               </w:rPr>
+              <w:t>xxxxxx by xxxxxx</w:t>
             </w:r>
           </w:p>
         </w:tc>
@@ -2895,22 +2902,34 @@
             <w:pPr>
               <w:jc w:val="left"/>
             </w:pPr>
-            <w:r/>
-            <w:r/>
-            <w:r/>
-            <w:r/>
-            <w:r/>
-          </w:p>
-          <w:p>
-            <w:pPr>
-              <w:jc w:val="left"/>
-            </w:pPr>
-          </w:p>
-          <w:p>
-            <w:pPr>
-              <w:jc w:val="left"/>
-            </w:pPr>
-            <w:r/>
+            <w:r>
+              <w:t>We advise that you give yo</w:t>
+            </w:r>
+            <w:r>
+              <w:t>ur employees information on the</w:t>
+            </w:r>
+            <w:r>
+              <w:t xml:space="preserve"> key value</w:t>
+            </w:r>
+            <w:r>
+              <w:t>s</w:t>
+            </w:r>
+            <w:r>
+              <w:t xml:space="preserve"> that your organisation prides itself on and that you wish to continue. </w:t>
+            </w:r>
+          </w:p>
+          <w:p>
+            <w:pPr>
+              <w:jc w:val="left"/>
+            </w:pPr>
+          </w:p>
+          <w:p>
+            <w:pPr>
+              <w:jc w:val="left"/>
+            </w:pPr>
+            <w:r>
+              <w:t xml:space="preserve">You could base these values around the 6c’s and/or the Person Centred Values: </w:t>
+            </w:r>
           </w:p>
           <w:p>
             <w:pPr>
@@ -2923,6 +2942,7 @@
               <w:rPr>
                 <w:color w:val="FF0000"/>
               </w:rPr>
+              <w:t xml:space="preserve">Care: </w:t>
             </w:r>
           </w:p>
           <w:p>
@@ -2936,6 +2956,7 @@
               <w:rPr>
                 <w:color w:val="FF0000"/>
               </w:rPr>
+              <w:t>Compassion;</w:t>
             </w:r>
           </w:p>
           <w:p>
@@ -2949,6 +2970,7 @@
               <w:rPr>
                 <w:color w:val="FF0000"/>
               </w:rPr>
+              <w:t>Competence:</w:t>
             </w:r>
           </w:p>
           <w:p>
@@ -2962,6 +2984,7 @@
               <w:rPr>
                 <w:color w:val="FF0000"/>
               </w:rPr>
+              <w:t>Communication:</w:t>
             </w:r>
           </w:p>
           <w:p>
@@ -2975,6 +2998,7 @@
               <w:rPr>
                 <w:color w:val="FF0000"/>
               </w:rPr>
+              <w:t>Courage:</w:t>
             </w:r>
           </w:p>
           <w:p>
@@ -2988,6 +3012,7 @@
               <w:rPr>
                 <w:color w:val="FF0000"/>
               </w:rPr>
+              <w:t xml:space="preserve">Commitment: </w:t>
             </w:r>
           </w:p>
           <w:p>
@@ -3009,6 +3034,7 @@
               <w:rPr>
                 <w:color w:val="FF0000"/>
               </w:rPr>
+              <w:t>OR</w:t>
             </w:r>
           </w:p>
           <w:p>
@@ -3030,6 +3056,7 @@
               <w:rPr>
                 <w:color w:val="FF0000"/>
               </w:rPr>
+              <w:t>Individuality:</w:t>
             </w:r>
           </w:p>
           <w:p>
@@ -3043,6 +3070,7 @@
               <w:rPr>
                 <w:color w:val="FF0000"/>
               </w:rPr>
+              <w:t>Rights:</w:t>
             </w:r>
           </w:p>
           <w:p>
@@ -3056,6 +3084,7 @@
               <w:rPr>
                 <w:color w:val="FF0000"/>
               </w:rPr>
+              <w:t>Choice:</w:t>
             </w:r>
           </w:p>
           <w:p>
@@ -3069,6 +3098,7 @@
               <w:rPr>
                 <w:color w:val="FF0000"/>
               </w:rPr>
+              <w:t>Privacy:</w:t>
             </w:r>
           </w:p>
           <w:p>
@@ -3082,6 +3112,7 @@
               <w:rPr>
                 <w:color w:val="FF0000"/>
               </w:rPr>
+              <w:t xml:space="preserve">Independence: </w:t>
             </w:r>
           </w:p>
           <w:p>
@@ -3095,6 +3126,7 @@
               <w:rPr>
                 <w:color w:val="FF0000"/>
               </w:rPr>
+              <w:t>Dignity:</w:t>
             </w:r>
           </w:p>
           <w:p>
@@ -3108,6 +3140,7 @@
               <w:rPr>
                 <w:color w:val="FF0000"/>
               </w:rPr>
+              <w:t>Respect:</w:t>
             </w:r>
           </w:p>
           <w:p>
@@ -3118,6 +3151,7 @@
               <w:rPr>
                 <w:color w:val="FF0000"/>
               </w:rPr>
+              <w:t xml:space="preserve">Partnership: </w:t>
             </w:r>
           </w:p>
         </w:tc>
@@ -3206,7 +3240,9 @@
             <w:pPr>
               <w:jc w:val="left"/>
             </w:pPr>
-            <w:r/>
+            <w:r>
+              <w:t xml:space="preserve">We advise that you include clear aims and objectives that you wish for the organisation. You could use clear bullet points: </w:t>
+            </w:r>
           </w:p>
           <w:p>
             <w:pPr>
@@ -3245,11 +3281,14 @@
                 <w:color w:val="auto"/>
               </w:rPr>
             </w:pPr>
-            <w:r/>
-            <w:r>
-              <w:rPr>
-                <w:color w:val="auto"/>
-              </w:rPr>
+            <w:r>
+              <w:t xml:space="preserve">To </w:t>
+            </w:r>
+            <w:r>
+              <w:rPr>
+                <w:color w:val="auto"/>
+              </w:rPr>
+              <w:t>deliver xxxx</w:t>
             </w:r>
           </w:p>
           <w:p>
@@ -3268,6 +3307,7 @@
               <w:rPr>
                 <w:color w:val="auto"/>
               </w:rPr>
+              <w:t>To provide xxxx</w:t>
             </w:r>
           </w:p>
           <w:p>
@@ -3286,6 +3326,7 @@
               <w:rPr>
                 <w:color w:val="auto"/>
               </w:rPr>
+              <w:t>To support xxxx</w:t>
             </w:r>
           </w:p>
           <w:p>
@@ -3301,8 +3342,11 @@
               <w:rPr>
                 <w:color w:val="auto"/>
               </w:rPr>
-            </w:r>
-            <w:r/>
+              <w:t>To ensure</w:t>
+            </w:r>
+            <w:r>
+              <w:t xml:space="preserve"> xxxx</w:t>
+            </w:r>
           </w:p>
           <w:p>
             <w:pPr>
@@ -3350,16 +3394,19 @@
         <w:rPr>
           <w:color w:val="FF0000"/>
         </w:rPr>
+        <w:t>We advise that you include a simple and clear staff structure within your organisation. This supports your employees to recognise role</w:t>
       </w:r>
       <w:r>
         <w:rPr>
           <w:color w:val="FF0000"/>
         </w:rPr>
+        <w:t>s</w:t>
       </w:r>
       <w:r>
         <w:rPr>
           <w:color w:val="FF0000"/>
         </w:rPr>
+        <w:t xml:space="preserve"> and responsibilities and know who to report to.</w:t>
       </w:r>
     </w:p>
     <w:p>
@@ -6070,23 +6117,26 @@
               <w:rPr>
                 <w:rFonts w:cs="Arial"/>
               </w:rPr>
-              <w:t>You join us on an initial probationary period of 9 months . During this time, dismissals may occur under a ‘lighter touch’ dismissal process, which allows for a streamlined assessment of suitability. After completing probation, full dismissal rights apply.</w:t>
+              <w:t>You join us on an initial probationa</w:t>
             </w:r>
             <w:r>
               <w:rPr>
                 <w:rFonts w:cs="Arial"/>
               </w:rPr>
+              <w:t xml:space="preserve">ry period of </w:t>
             </w:r>
             <w:r>
               <w:rPr>
                 <w:rFonts w:cs="Arial"/>
                 <w:color w:val="FF0000"/>
               </w:rPr>
+              <w:t>9 months</w:t>
             </w:r>
             <w:r>
               <w:rPr>
                 <w:rFonts w:cs="Arial"/>
               </w:rPr>
+              <w:t xml:space="preserve"> </w:t>
             </w:r>
             <w:r>
               <w:rPr>
@@ -6094,16 +6144,19 @@
                 <w:i/>
                 <w:color w:val="FF0000"/>
               </w:rPr>
+              <w:t>(add duration of probation)</w:t>
             </w:r>
             <w:r>
               <w:rPr>
                 <w:rFonts w:cs="Arial"/>
               </w:rPr>
+              <w:t xml:space="preserve">. </w:t>
             </w:r>
             <w:r>
               <w:rPr>
                 <w:rFonts w:cs="Arial"/>
               </w:rPr>
+              <w:t xml:space="preserve">During this time, dismissals may occur under a ‘lighter touch’ dismissal process, which allows for a streamlined assessment of suitability. After completing probation, full dismissal rights apply. </w:t>
             </w:r>
           </w:p>
           <w:p>
@@ -8131,35 +8184,44 @@
               <w:rPr>
                 <w:color w:val="000000"/>
               </w:rPr>
-              <w:t xml:space="preserve">Osabea Healthcare Solutions Ltd provide a mileage allowance for certain journeys which are made in the course of your employment. This is paid at a rate of {{mileage_rate}} pence per mile and excludes journeys made to and from your home. The rate of the mileage allowance may vary on occasions at the organisation’s discretion. </w:t>
+              <w:t>Osabea Healthcare Solutions Ltd</w:t>
             </w:r>
             <w:r>
               <w:rPr>
                 <w:color w:val="FF0000"/>
               </w:rPr>
-            </w:r>
-            <w:r/>
+              <w:t xml:space="preserve"> </w:t>
+            </w:r>
+            <w:r>
+              <w:t xml:space="preserve">provide a mileage allowance for certain journeys which are made in the course of your employment. This is paid at a rate of </w:t>
+            </w:r>
             <w:r>
               <w:rPr>
                 <w:color w:val="FF0000"/>
               </w:rPr>
+              <w:t>[</w:t>
             </w:r>
             <w:r>
               <w:rPr>
                 <w:color w:val="FF0000"/>
               </w:rPr>
+              <w:t>25</w:t>
             </w:r>
             <w:r>
               <w:rPr>
                 <w:color w:val="FF0000"/>
               </w:rPr>
+              <w:t xml:space="preserve"> pence per mile]</w:t>
             </w:r>
             <w:r>
               <w:rPr>
                 <w:color w:val="FF0000"/>
               </w:rPr>
-            </w:r>
-            <w:r/>
+              <w:t xml:space="preserve"> </w:t>
+            </w:r>
+            <w:r>
+              <w:t xml:space="preserve">and excludes journeys made to and from your home. The rate of the mileage allowance may vary on occasions at the organisation’s discretion. </w:t>
+            </w:r>
           </w:p>
           <w:p>
             <w:pPr>
@@ -9261,16 +9323,19 @@
               <w:rPr>
                 <w:color w:val="FF0000"/>
               </w:rPr>
+              <w:t>[Add other benefits for your employees that have not already been mentioned</w:t>
             </w:r>
             <w:r>
               <w:rPr>
                 <w:color w:val="FF0000"/>
               </w:rPr>
+              <w:t>, if required</w:t>
             </w:r>
             <w:r>
               <w:rPr>
                 <w:color w:val="FF0000"/>
               </w:rPr>
+              <w:t xml:space="preserve">] </w:t>
             </w:r>
           </w:p>
           <w:p>

</xml_diff>